<commit_message>
Unit 2 test Day 2: six configurations only (P with diagram, V, Ga longhand; Cd, Hg, Cr shorthand), 14 pts, no written responses
Co-Authored-By: Claude Opus 5.5 <noreply@anthropic.com>
Claude-Session: https://claude.ai/code/session_01LaT1EarAMnh5opQoFahNzN
</commit_message>
<xml_diff>
--- a/output/chem-u02/Unit 2 Test - Day 2 Written.docx
+++ b/output/chem-u02/Unit 2 Test - Day 2 Written.docx
@@ -202,7 +202,7 @@
                 <w:sz w:val="15"/>
                 <w:u w:val="none"/>
               </w:rPr>
-              <w:t>SCORE  / 25</w:t>
+              <w:t>SCORE  / 14</w:t>
             </w:r>
           </w:p>
         </w:tc>
@@ -258,7 +258,7 @@
                 <w:sz w:val="19"/>
                 <w:u w:val="none"/>
               </w:rPr>
-              <w:t>You may use a periodic table. Write every configuration in order of filling. In an orbital diagram, each electron gets one arrow.</w:t>
+              <w:t>You may use a periodic table. Write every configuration in order of filling. In the orbital diagram, each electron gets one arrow.</w:t>
             </w:r>
           </w:p>
         </w:tc>
@@ -315,7 +315,7 @@
                 <w:sz w:val="20"/>
                 <w:u w:val="none"/>
               </w:rPr>
-              <w:t>Part 1   Longhand configurations and orbital diagrams</w:t>
+              <w:t>Part 1   Longhand configurations</w:t>
             </w:r>
           </w:p>
         </w:tc>
@@ -364,6 +364,46 @@
         </w:rPr>
       </w:r>
     </w:p>
+    <w:tbl>
+      <w:tblPr>
+        <w:tblW w:type="auto" w:w="0"/>
+        <w:jc w:val="left"/>
+        <w:tblLayout w:type="fixed"/>
+        <w:tblLook w:firstColumn="1" w:firstRow="1" w:lastColumn="0" w:lastRow="0" w:noHBand="0" w:noVBand="1" w:val="04A0"/>
+        <w:tblLayout w:type="fixed"/>
+      </w:tblPr>
+      <w:tblGrid>
+        <w:gridCol w:w="10800"/>
+      </w:tblGrid>
+      <w:tr>
+        <w:tc>
+          <w:tcPr>
+            <w:tcW w:type="dxa" w:w="10800"/>
+            <w:tcMar>
+              <w:top w:w="0" w:type="dxa"/>
+              <w:left w:w="0" w:type="dxa"/>
+              <w:bottom w:w="30" w:type="dxa"/>
+              <w:right w:w="0" w:type="dxa"/>
+            </w:tcMar>
+          </w:tcPr>
+          <w:p>
+            <w:pPr>
+              <w:spacing w:after="0"/>
+            </w:pPr>
+            <w:r>
+              <w:rPr>
+                <w:rFonts w:ascii="Trade Gothic Next" w:hAnsi="Trade Gothic Next"/>
+                <w:b w:val="0"/>
+                <w:color w:val="55604F"/>
+                <w:sz w:val="19"/>
+                <w:u w:val="none"/>
+              </w:rPr>
+              <w:t>Number 1 also needs its orbital diagram.</w:t>
+            </w:r>
+          </w:p>
+        </w:tc>
+      </w:tr>
+    </w:tbl>
     <w:tbl>
       <w:tblPr>
         <w:tblW w:type="auto" w:w="0"/>
@@ -439,7 +479,7 @@
                     <a:graphicData uri="http://schemas.openxmlformats.org/drawingml/2006/picture">
                       <pic:pic>
                         <pic:nvPicPr>
-                          <pic:cNvPr id="0" name="tile_23.png"/>
+                          <pic:cNvPr id="0" name="tile_15.png"/>
                           <pic:cNvPicPr/>
                         </pic:nvPicPr>
                         <pic:blipFill>
@@ -481,7 +521,6 @@
             <w:pPr>
               <w:tabs>
                 <w:tab w:pos="1800" w:val="left"/>
-                <w:tab w:pos="8352" w:val="right"/>
               </w:tabs>
               <w:spacing w:after="0"/>
               <w:jc w:val="left"/>
@@ -504,26 +543,6 @@
                 <w:u w:val="none"/>
               </w:rPr>
               <w:tab/>
-            </w:r>
-            <w:r>
-              <w:rPr>
-                <w:rFonts w:ascii="Trade Gothic Next" w:hAnsi="Trade Gothic Next"/>
-                <w:b/>
-                <w:color w:val="14161B"/>
-                <w:sz w:val="18"/>
-                <w:u w:val="none"/>
-              </w:rPr>
-              <w:tab/>
-              <w:t>Unpaired</w:t>
-            </w:r>
-            <w:r>
-              <w:rPr>
-                <w:rFonts w:ascii="Trade Gothic Next" w:hAnsi="Trade Gothic Next"/>
-                <w:b w:val="0"/>
-                <w:sz w:val="18"/>
-                <w:u w:val="none"/>
-              </w:rPr>
-              <w:t xml:space="preserve"> ____ </w:t>
             </w:r>
           </w:p>
         </w:tc>
@@ -628,12 +647,12 @@
     </w:tbl>
     <w:p>
       <w:pPr>
-        <w:spacing w:before="0" w:after="0" w:line="100" w:lineRule="exact"/>
+        <w:spacing w:before="0" w:after="0" w:line="160" w:lineRule="exact"/>
       </w:pPr>
       <w:r>
         <w:rPr>
           <w:rFonts w:ascii="Trade Gothic Next" w:hAnsi="Trade Gothic Next"/>
-          <w:sz w:val="6"/>
+          <w:sz w:val="12"/>
         </w:rPr>
       </w:r>
     </w:p>
@@ -646,18 +665,17 @@
       </w:tblPr>
       <w:tblGrid>
         <w:gridCol w:w="648"/>
-        <w:gridCol w:w="1656"/>
-        <w:gridCol w:w="8496"/>
+        <w:gridCol w:w="1440"/>
+        <w:gridCol w:w="8712"/>
       </w:tblGrid>
       <w:tr>
         <w:trPr>
           <w:cantSplit/>
-          <w:trHeight w:val="547" w:hRule="exact"/>
+          <w:trHeight w:val="1209" w:hRule="atLeast"/>
         </w:trPr>
         <w:tc>
           <w:tcPr>
             <w:tcW w:type="dxa" w:w="648"/>
-            <w:vMerge w:val="restart"/>
             <w:vAlign w:val="center"/>
             <w:tcMar>
               <w:top w:w="40" w:type="dxa"/>
@@ -685,8 +703,7 @@
         </w:tc>
         <w:tc>
           <w:tcPr>
-            <w:tcW w:type="dxa" w:w="1656"/>
-            <w:vMerge w:val="restart"/>
+            <w:tcW w:type="dxa" w:w="1440"/>
             <w:vAlign w:val="center"/>
             <w:tcMar>
               <w:top w:w="0" w:type="dxa"/>
@@ -703,7 +720,7 @@
             <w:r>
               <w:drawing>
                 <wp:inline xmlns:a="http://schemas.openxmlformats.org/drawingml/2006/main" xmlns:pic="http://schemas.openxmlformats.org/drawingml/2006/picture">
-                  <wp:extent cx="877824" cy="877824"/>
+                  <wp:extent cx="731520" cy="731520"/>
                   <wp:docPr id="2" name="Picture 2"/>
                   <wp:cNvGraphicFramePr>
                     <a:graphicFrameLocks noChangeAspect="1"/>
@@ -712,7 +729,7 @@
                     <a:graphicData uri="http://schemas.openxmlformats.org/drawingml/2006/picture">
                       <pic:pic>
                         <pic:nvPicPr>
-                          <pic:cNvPr id="0" name="tile_13.png"/>
+                          <pic:cNvPr id="0" name="tile_23.png"/>
                           <pic:cNvPicPr/>
                         </pic:nvPicPr>
                         <pic:blipFill>
@@ -724,7 +741,7 @@
                         <pic:spPr>
                           <a:xfrm>
                             <a:off x="0" y="0"/>
-                            <a:ext cx="877824" cy="877824"/>
+                            <a:ext cx="731520" cy="731520"/>
                           </a:xfrm>
                           <a:prstGeom prst="rect"/>
                         </pic:spPr>
@@ -738,12 +755,12 @@
         </w:tc>
         <w:tc>
           <w:tcPr>
-            <w:tcW w:type="dxa" w:w="8496"/>
+            <w:tcW w:type="dxa" w:w="8712"/>
             <w:vAlign w:val="bottom"/>
             <w:tcMar>
               <w:top w:w="0" w:type="dxa"/>
               <w:left w:w="80" w:type="dxa"/>
-              <w:bottom w:w="20" w:type="dxa"/>
+              <w:bottom w:w="30" w:type="dxa"/>
               <w:right w:w="60" w:type="dxa"/>
             </w:tcMar>
             <w:tcBorders>
@@ -754,7 +771,6 @@
             <w:pPr>
               <w:tabs>
                 <w:tab w:pos="1800" w:val="left"/>
-                <w:tab w:pos="8352" w:val="right"/>
               </w:tabs>
               <w:spacing w:after="0"/>
               <w:jc w:val="left"/>
@@ -778,51 +794,70 @@
               </w:rPr>
               <w:tab/>
             </w:r>
+          </w:p>
+        </w:tc>
+      </w:tr>
+    </w:tbl>
+    <w:p>
+      <w:pPr>
+        <w:spacing w:before="0" w:after="0" w:line="160" w:lineRule="exact"/>
+      </w:pPr>
+      <w:r>
+        <w:rPr>
+          <w:rFonts w:ascii="Trade Gothic Next" w:hAnsi="Trade Gothic Next"/>
+          <w:sz w:val="12"/>
+        </w:rPr>
+      </w:r>
+    </w:p>
+    <w:tbl>
+      <w:tblPr>
+        <w:tblW w:type="auto" w:w="0"/>
+        <w:tblLayout w:type="fixed"/>
+        <w:tblLook w:firstColumn="1" w:firstRow="1" w:lastColumn="0" w:lastRow="0" w:noHBand="0" w:noVBand="1" w:val="04A0"/>
+        <w:tblLayout w:type="fixed"/>
+      </w:tblPr>
+      <w:tblGrid>
+        <w:gridCol w:w="648"/>
+        <w:gridCol w:w="1440"/>
+        <w:gridCol w:w="8712"/>
+      </w:tblGrid>
+      <w:tr>
+        <w:trPr>
+          <w:cantSplit/>
+          <w:trHeight w:val="1209" w:hRule="atLeast"/>
+        </w:trPr>
+        <w:tc>
+          <w:tcPr>
+            <w:tcW w:type="dxa" w:w="648"/>
+            <w:vAlign w:val="center"/>
+            <w:tcMar>
+              <w:top w:w="40" w:type="dxa"/>
+              <w:left w:w="20" w:type="dxa"/>
+              <w:bottom w:w="40" w:type="dxa"/>
+              <w:right w:w="20" w:type="dxa"/>
+            </w:tcMar>
+          </w:tcPr>
+          <w:p>
+            <w:pPr>
+              <w:spacing w:after="0"/>
+              <w:jc w:val="left"/>
+            </w:pPr>
             <w:r>
               <w:rPr>
                 <w:rFonts w:ascii="Trade Gothic Next" w:hAnsi="Trade Gothic Next"/>
                 <w:b/>
-                <w:color w:val="14161B"/>
-                <w:sz w:val="18"/>
+                <w:color w:val="4D730E"/>
+                <w:sz w:val="26"/>
                 <w:u w:val="none"/>
               </w:rPr>
-              <w:tab/>
-              <w:t>Unpaired</w:t>
-            </w:r>
-            <w:r>
-              <w:rPr>
-                <w:rFonts w:ascii="Trade Gothic Next" w:hAnsi="Trade Gothic Next"/>
-                <w:b w:val="0"/>
-                <w:sz w:val="18"/>
-                <w:u w:val="none"/>
-              </w:rPr>
-              <w:t xml:space="preserve"> ____ </w:t>
+              <w:t>3</w:t>
             </w:r>
           </w:p>
         </w:tc>
-      </w:tr>
-      <w:tr>
-        <w:trPr>
-          <w:cantSplit/>
-          <w:trHeight w:val="86" w:hRule="exact"/>
-        </w:trPr>
         <w:tc>
           <w:tcPr>
-            <w:tcW w:type="dxa" w:w="648"/>
-            <w:vMerge/>
-          </w:tcPr>
-          <w:p/>
-        </w:tc>
-        <w:tc>
-          <w:tcPr>
-            <w:tcW w:type="dxa" w:w="1656"/>
-            <w:vMerge/>
-          </w:tcPr>
-          <w:p/>
-        </w:tc>
-        <w:tc>
-          <w:tcPr>
-            <w:tcW w:type="dxa" w:w="8496"/>
+            <w:tcW w:type="dxa" w:w="1440"/>
+            <w:vAlign w:val="center"/>
             <w:tcMar>
               <w:top w:w="0" w:type="dxa"/>
               <w:left w:w="0" w:type="dxa"/>
@@ -833,67 +868,84 @@
           <w:p>
             <w:pPr>
               <w:spacing w:after="0"/>
+              <w:jc w:val="left"/>
+            </w:pPr>
+            <w:r>
+              <w:drawing>
+                <wp:inline xmlns:a="http://schemas.openxmlformats.org/drawingml/2006/main" xmlns:pic="http://schemas.openxmlformats.org/drawingml/2006/picture">
+                  <wp:extent cx="731520" cy="731520"/>
+                  <wp:docPr id="3" name="Picture 3"/>
+                  <wp:cNvGraphicFramePr>
+                    <a:graphicFrameLocks noChangeAspect="1"/>
+                  </wp:cNvGraphicFramePr>
+                  <a:graphic>
+                    <a:graphicData uri="http://schemas.openxmlformats.org/drawingml/2006/picture">
+                      <pic:pic>
+                        <pic:nvPicPr>
+                          <pic:cNvPr id="0" name="tile_31.png"/>
+                          <pic:cNvPicPr/>
+                        </pic:nvPicPr>
+                        <pic:blipFill>
+                          <a:blip r:embed="rId11"/>
+                          <a:stretch>
+                            <a:fillRect/>
+                          </a:stretch>
+                        </pic:blipFill>
+                        <pic:spPr>
+                          <a:xfrm>
+                            <a:off x="0" y="0"/>
+                            <a:ext cx="731520" cy="731520"/>
+                          </a:xfrm>
+                          <a:prstGeom prst="rect"/>
+                        </pic:spPr>
+                      </pic:pic>
+                    </a:graphicData>
+                  </a:graphic>
+                </wp:inline>
+              </w:drawing>
+            </w:r>
+          </w:p>
+        </w:tc>
+        <w:tc>
+          <w:tcPr>
+            <w:tcW w:type="dxa" w:w="8712"/>
+            <w:vAlign w:val="bottom"/>
+            <w:tcMar>
+              <w:top w:w="0" w:type="dxa"/>
+              <w:left w:w="80" w:type="dxa"/>
+              <w:bottom w:w="30" w:type="dxa"/>
+              <w:right w:w="60" w:type="dxa"/>
+            </w:tcMar>
+            <w:tcBorders>
+              <w:bottom w:val="single" w:sz="4" w:color="C8CDC2"/>
+            </w:tcBorders>
+          </w:tcPr>
+          <w:p>
+            <w:pPr>
+              <w:tabs>
+                <w:tab w:pos="1800" w:val="left"/>
+              </w:tabs>
+              <w:spacing w:after="0"/>
+              <w:jc w:val="left"/>
             </w:pPr>
             <w:r>
               <w:rPr>
                 <w:rFonts w:ascii="Trade Gothic Next" w:hAnsi="Trade Gothic Next"/>
-                <w:b w:val="0"/>
-                <w:sz w:val="4"/>
+                <w:b/>
+                <w:color w:val="14161B"/>
+                <w:sz w:val="18"/>
                 <w:u w:val="none"/>
               </w:rPr>
+              <w:t>Configuration</w:t>
             </w:r>
-          </w:p>
-        </w:tc>
-      </w:tr>
-      <w:tr>
-        <w:trPr>
-          <w:cantSplit/>
-          <w:trHeight w:val="806" w:hRule="exact"/>
-        </w:trPr>
-        <w:tc>
-          <w:tcPr>
-            <w:tcW w:type="dxa" w:w="648"/>
-            <w:vMerge/>
-          </w:tcPr>
-          <w:p/>
-        </w:tc>
-        <w:tc>
-          <w:tcPr>
-            <w:tcW w:type="dxa" w:w="1656"/>
-            <w:vMerge/>
-          </w:tcPr>
-          <w:p/>
-        </w:tc>
-        <w:tc>
-          <w:tcPr>
-            <w:tcW w:type="dxa" w:w="8496"/>
-            <w:tcBorders>
-              <w:top w:val="single" w:sz="6" w:color="C8CDC2"/>
-              <w:left w:val="single" w:sz="6" w:color="C8CDC2"/>
-              <w:bottom w:val="single" w:sz="6" w:color="C8CDC2"/>
-              <w:right w:val="single" w:sz="6" w:color="C8CDC2"/>
-            </w:tcBorders>
-            <w:vAlign w:val="top"/>
-            <w:tcMar>
-              <w:top w:w="30" w:type="dxa"/>
-              <w:left w:w="80" w:type="dxa"/>
-              <w:bottom w:w="20" w:type="dxa"/>
-              <w:right w:w="40" w:type="dxa"/>
-            </w:tcMar>
-          </w:tcPr>
-          <w:p>
-            <w:pPr>
-              <w:spacing w:after="20"/>
-            </w:pPr>
             <w:r>
               <w:rPr>
                 <w:rFonts w:ascii="Trade Gothic Next" w:hAnsi="Trade Gothic Next"/>
                 <w:b w:val="0"/>
-                <w:color w:val="55604F"/>
-                <w:sz w:val="17"/>
+                <w:sz w:val="18"/>
                 <w:u w:val="none"/>
               </w:rPr>
-              <w:t>Orbital diagram</w:t>
+              <w:tab/>
             </w:r>
           </w:p>
         </w:tc>
@@ -901,12 +953,12 @@
     </w:tbl>
     <w:p>
       <w:pPr>
-        <w:spacing w:before="0" w:after="0" w:line="100" w:lineRule="exact"/>
+        <w:spacing w:before="0" w:after="0" w:line="160" w:lineRule="exact"/>
       </w:pPr>
       <w:r>
         <w:rPr>
           <w:rFonts w:ascii="Trade Gothic Next" w:hAnsi="Trade Gothic Next"/>
-          <w:sz w:val="6"/>
+          <w:sz w:val="12"/>
         </w:rPr>
       </w:r>
     </w:p>
@@ -1018,8 +1070,9 @@
         <w:tblLayout w:type="fixed"/>
       </w:tblPr>
       <w:tblGrid>
-        <w:gridCol w:w="5400"/>
-        <w:gridCol w:w="5400"/>
+        <w:gridCol w:w="3600"/>
+        <w:gridCol w:w="3600"/>
+        <w:gridCol w:w="3600"/>
       </w:tblGrid>
       <w:tr>
         <w:trPr>
@@ -1027,121 +1080,13 @@
         </w:trPr>
         <w:tc>
           <w:tcPr>
-            <w:tcW w:type="dxa" w:w="5400"/>
+            <w:tcW w:type="dxa" w:w="3600"/>
             <w:vAlign w:val="top"/>
             <w:tcMar>
               <w:top w:w="0" w:type="dxa"/>
               <w:left w:w="0" w:type="dxa"/>
               <w:bottom w:w="0" w:type="dxa"/>
-              <w:right w:w="160" w:type="dxa"/>
-            </w:tcMar>
-          </w:tcPr>
-          <w:p>
-            <w:pPr>
-              <w:spacing w:after="20"/>
-            </w:pPr>
-            <w:r>
-              <w:rPr>
-                <w:rFonts w:ascii="Trade Gothic Next" w:hAnsi="Trade Gothic Next"/>
-                <w:b/>
-                <w:color w:val="4D730E"/>
-                <w:sz w:val="26"/>
-                <w:u w:val="none"/>
-              </w:rPr>
-              <w:t>3</w:t>
-            </w:r>
-          </w:p>
-          <w:p>
-            <w:pPr>
-              <w:spacing w:after="40"/>
-            </w:pPr>
-            <w:r>
-              <w:drawing>
-                <wp:inline xmlns:a="http://schemas.openxmlformats.org/drawingml/2006/main" xmlns:pic="http://schemas.openxmlformats.org/drawingml/2006/picture">
-                  <wp:extent cx="731520" cy="731520"/>
-                  <wp:docPr id="3" name="Picture 3"/>
-                  <wp:cNvGraphicFramePr>
-                    <a:graphicFrameLocks noChangeAspect="1"/>
-                  </wp:cNvGraphicFramePr>
-                  <a:graphic>
-                    <a:graphicData uri="http://schemas.openxmlformats.org/drawingml/2006/picture">
-                      <pic:pic>
-                        <pic:nvPicPr>
-                          <pic:cNvPr id="0" name="tile_80.png"/>
-                          <pic:cNvPicPr/>
-                        </pic:nvPicPr>
-                        <pic:blipFill>
-                          <a:blip r:embed="rId11"/>
-                          <a:stretch>
-                            <a:fillRect/>
-                          </a:stretch>
-                        </pic:blipFill>
-                        <pic:spPr>
-                          <a:xfrm>
-                            <a:off x="0" y="0"/>
-                            <a:ext cx="731520" cy="731520"/>
-                          </a:xfrm>
-                          <a:prstGeom prst="rect"/>
-                        </pic:spPr>
-                      </pic:pic>
-                    </a:graphicData>
-                  </a:graphic>
-                </wp:inline>
-              </w:drawing>
-            </w:r>
-          </w:p>
-          <w:tbl>
-            <w:tblPr>
-              <w:tblW w:type="auto" w:w="0"/>
-              <w:tblLayout w:type="fixed"/>
-              <w:tblLook w:firstColumn="1" w:firstRow="1" w:lastColumn="0" w:lastRow="0" w:noHBand="0" w:noVBand="1" w:val="04A0"/>
-              <w:tblLayout w:type="fixed"/>
-            </w:tblPr>
-            <w:tblGrid>
-              <w:gridCol w:w="5040"/>
-            </w:tblGrid>
-            <w:tr>
-              <w:trPr>
-                <w:cantSplit/>
-                <w:trHeight w:val="518" w:hRule="atLeast"/>
-              </w:trPr>
-              <w:tc>
-                <w:tcPr>
-                  <w:tcW w:type="dxa" w:w="5040"/>
-                  <w:vAlign w:val="bottom"/>
-                  <w:tcBorders>
-                    <w:bottom w:val="single" w:sz="6" w:color="C8CDC2"/>
-                  </w:tcBorders>
-                  <w:tcMar>
-                    <w:top w:w="0" w:type="dxa"/>
-                    <w:left w:w="40" w:type="dxa"/>
-                    <w:bottom w:w="20" w:type="dxa"/>
-                    <w:right w:w="0" w:type="dxa"/>
-                  </w:tcMar>
-                </w:tcPr>
-                <w:p>
-                  <w:pPr>
-                    <w:spacing w:after="0"/>
-                  </w:pPr>
-                </w:p>
-              </w:tc>
-            </w:tr>
-          </w:tbl>
-          <w:p>
-            <w:pPr>
-              <w:spacing w:before="0" w:after="0" w:line="20" w:lineRule="exact"/>
-            </w:pPr>
-          </w:p>
-        </w:tc>
-        <w:tc>
-          <w:tcPr>
-            <w:tcW w:type="dxa" w:w="5400"/>
-            <w:vAlign w:val="top"/>
-            <w:tcMar>
-              <w:top w:w="0" w:type="dxa"/>
-              <w:left w:w="0" w:type="dxa"/>
-              <w:bottom w:w="0" w:type="dxa"/>
-              <w:right w:w="160" w:type="dxa"/>
+              <w:right w:w="140" w:type="dxa"/>
             </w:tcMar>
           </w:tcPr>
           <w:p>
@@ -1175,7 +1120,7 @@
                     <a:graphicData uri="http://schemas.openxmlformats.org/drawingml/2006/picture">
                       <pic:pic>
                         <pic:nvPicPr>
-                          <pic:cNvPr id="0" name="tile_24.png"/>
+                          <pic:cNvPr id="0" name="tile_48.png"/>
                           <pic:cNvPicPr/>
                         </pic:nvPicPr>
                         <pic:blipFill>
@@ -1206,16 +1151,232 @@
               <w:tblLayout w:type="fixed"/>
             </w:tblPr>
             <w:tblGrid>
-              <w:gridCol w:w="5040"/>
+              <w:gridCol w:w="3312"/>
             </w:tblGrid>
             <w:tr>
               <w:trPr>
                 <w:cantSplit/>
-                <w:trHeight w:val="518" w:hRule="atLeast"/>
+                <w:trHeight w:val="576" w:hRule="atLeast"/>
               </w:trPr>
               <w:tc>
                 <w:tcPr>
-                  <w:tcW w:type="dxa" w:w="5040"/>
+                  <w:tcW w:type="dxa" w:w="3312"/>
+                  <w:vAlign w:val="bottom"/>
+                  <w:tcBorders>
+                    <w:bottom w:val="single" w:sz="6" w:color="C8CDC2"/>
+                  </w:tcBorders>
+                  <w:tcMar>
+                    <w:top w:w="0" w:type="dxa"/>
+                    <w:left w:w="40" w:type="dxa"/>
+                    <w:bottom w:w="20" w:type="dxa"/>
+                    <w:right w:w="0" w:type="dxa"/>
+                  </w:tcMar>
+                </w:tcPr>
+                <w:p>
+                  <w:pPr>
+                    <w:spacing w:after="0"/>
+                  </w:pPr>
+                </w:p>
+              </w:tc>
+            </w:tr>
+          </w:tbl>
+          <w:p>
+            <w:pPr>
+              <w:spacing w:before="0" w:after="0" w:line="20" w:lineRule="exact"/>
+            </w:pPr>
+          </w:p>
+        </w:tc>
+        <w:tc>
+          <w:tcPr>
+            <w:tcW w:type="dxa" w:w="3600"/>
+            <w:vAlign w:val="top"/>
+            <w:tcMar>
+              <w:top w:w="0" w:type="dxa"/>
+              <w:left w:w="0" w:type="dxa"/>
+              <w:bottom w:w="0" w:type="dxa"/>
+              <w:right w:w="140" w:type="dxa"/>
+            </w:tcMar>
+          </w:tcPr>
+          <w:p>
+            <w:pPr>
+              <w:spacing w:after="20"/>
+            </w:pPr>
+            <w:r>
+              <w:rPr>
+                <w:rFonts w:ascii="Trade Gothic Next" w:hAnsi="Trade Gothic Next"/>
+                <w:b/>
+                <w:color w:val="4D730E"/>
+                <w:sz w:val="26"/>
+                <w:u w:val="none"/>
+              </w:rPr>
+              <w:t>5</w:t>
+            </w:r>
+          </w:p>
+          <w:p>
+            <w:pPr>
+              <w:spacing w:after="40"/>
+            </w:pPr>
+            <w:r>
+              <w:drawing>
+                <wp:inline xmlns:a="http://schemas.openxmlformats.org/drawingml/2006/main" xmlns:pic="http://schemas.openxmlformats.org/drawingml/2006/picture">
+                  <wp:extent cx="731520" cy="731520"/>
+                  <wp:docPr id="5" name="Picture 5"/>
+                  <wp:cNvGraphicFramePr>
+                    <a:graphicFrameLocks noChangeAspect="1"/>
+                  </wp:cNvGraphicFramePr>
+                  <a:graphic>
+                    <a:graphicData uri="http://schemas.openxmlformats.org/drawingml/2006/picture">
+                      <pic:pic>
+                        <pic:nvPicPr>
+                          <pic:cNvPr id="0" name="tile_80.png"/>
+                          <pic:cNvPicPr/>
+                        </pic:nvPicPr>
+                        <pic:blipFill>
+                          <a:blip r:embed="rId13"/>
+                          <a:stretch>
+                            <a:fillRect/>
+                          </a:stretch>
+                        </pic:blipFill>
+                        <pic:spPr>
+                          <a:xfrm>
+                            <a:off x="0" y="0"/>
+                            <a:ext cx="731520" cy="731520"/>
+                          </a:xfrm>
+                          <a:prstGeom prst="rect"/>
+                        </pic:spPr>
+                      </pic:pic>
+                    </a:graphicData>
+                  </a:graphic>
+                </wp:inline>
+              </w:drawing>
+            </w:r>
+          </w:p>
+          <w:tbl>
+            <w:tblPr>
+              <w:tblW w:type="auto" w:w="0"/>
+              <w:tblLayout w:type="fixed"/>
+              <w:tblLook w:firstColumn="1" w:firstRow="1" w:lastColumn="0" w:lastRow="0" w:noHBand="0" w:noVBand="1" w:val="04A0"/>
+              <w:tblLayout w:type="fixed"/>
+            </w:tblPr>
+            <w:tblGrid>
+              <w:gridCol w:w="3312"/>
+            </w:tblGrid>
+            <w:tr>
+              <w:trPr>
+                <w:cantSplit/>
+                <w:trHeight w:val="576" w:hRule="atLeast"/>
+              </w:trPr>
+              <w:tc>
+                <w:tcPr>
+                  <w:tcW w:type="dxa" w:w="3312"/>
+                  <w:vAlign w:val="bottom"/>
+                  <w:tcBorders>
+                    <w:bottom w:val="single" w:sz="6" w:color="C8CDC2"/>
+                  </w:tcBorders>
+                  <w:tcMar>
+                    <w:top w:w="0" w:type="dxa"/>
+                    <w:left w:w="40" w:type="dxa"/>
+                    <w:bottom w:w="20" w:type="dxa"/>
+                    <w:right w:w="0" w:type="dxa"/>
+                  </w:tcMar>
+                </w:tcPr>
+                <w:p>
+                  <w:pPr>
+                    <w:spacing w:after="0"/>
+                  </w:pPr>
+                </w:p>
+              </w:tc>
+            </w:tr>
+          </w:tbl>
+          <w:p>
+            <w:pPr>
+              <w:spacing w:before="0" w:after="0" w:line="20" w:lineRule="exact"/>
+            </w:pPr>
+          </w:p>
+        </w:tc>
+        <w:tc>
+          <w:tcPr>
+            <w:tcW w:type="dxa" w:w="3600"/>
+            <w:vAlign w:val="top"/>
+            <w:tcMar>
+              <w:top w:w="0" w:type="dxa"/>
+              <w:left w:w="0" w:type="dxa"/>
+              <w:bottom w:w="0" w:type="dxa"/>
+              <w:right w:w="140" w:type="dxa"/>
+            </w:tcMar>
+          </w:tcPr>
+          <w:p>
+            <w:pPr>
+              <w:spacing w:after="20"/>
+            </w:pPr>
+            <w:r>
+              <w:rPr>
+                <w:rFonts w:ascii="Trade Gothic Next" w:hAnsi="Trade Gothic Next"/>
+                <w:b/>
+                <w:color w:val="4D730E"/>
+                <w:sz w:val="26"/>
+                <w:u w:val="none"/>
+              </w:rPr>
+              <w:t>6</w:t>
+            </w:r>
+          </w:p>
+          <w:p>
+            <w:pPr>
+              <w:spacing w:after="40"/>
+            </w:pPr>
+            <w:r>
+              <w:drawing>
+                <wp:inline xmlns:a="http://schemas.openxmlformats.org/drawingml/2006/main" xmlns:pic="http://schemas.openxmlformats.org/drawingml/2006/picture">
+                  <wp:extent cx="731520" cy="731520"/>
+                  <wp:docPr id="6" name="Picture 6"/>
+                  <wp:cNvGraphicFramePr>
+                    <a:graphicFrameLocks noChangeAspect="1"/>
+                  </wp:cNvGraphicFramePr>
+                  <a:graphic>
+                    <a:graphicData uri="http://schemas.openxmlformats.org/drawingml/2006/picture">
+                      <pic:pic>
+                        <pic:nvPicPr>
+                          <pic:cNvPr id="0" name="tile_24.png"/>
+                          <pic:cNvPicPr/>
+                        </pic:nvPicPr>
+                        <pic:blipFill>
+                          <a:blip r:embed="rId14"/>
+                          <a:stretch>
+                            <a:fillRect/>
+                          </a:stretch>
+                        </pic:blipFill>
+                        <pic:spPr>
+                          <a:xfrm>
+                            <a:off x="0" y="0"/>
+                            <a:ext cx="731520" cy="731520"/>
+                          </a:xfrm>
+                          <a:prstGeom prst="rect"/>
+                        </pic:spPr>
+                      </pic:pic>
+                    </a:graphicData>
+                  </a:graphic>
+                </wp:inline>
+              </w:drawing>
+            </w:r>
+          </w:p>
+          <w:tbl>
+            <w:tblPr>
+              <w:tblW w:type="auto" w:w="0"/>
+              <w:tblLayout w:type="fixed"/>
+              <w:tblLook w:firstColumn="1" w:firstRow="1" w:lastColumn="0" w:lastRow="0" w:noHBand="0" w:noVBand="1" w:val="04A0"/>
+              <w:tblLayout w:type="fixed"/>
+            </w:tblPr>
+            <w:tblGrid>
+              <w:gridCol w:w="3312"/>
+            </w:tblGrid>
+            <w:tr>
+              <w:trPr>
+                <w:cantSplit/>
+                <w:trHeight w:val="576" w:hRule="atLeast"/>
+              </w:trPr>
+              <w:tc>
+                <w:tcPr>
+                  <w:tcW w:type="dxa" w:w="3312"/>
                   <w:vAlign w:val="bottom"/>
                   <w:tcBorders>
                     <w:bottom w:val="single" w:sz="6" w:color="C8CDC2"/>
@@ -1245,1367 +1406,6 @@
     </w:tbl>
     <w:p>
       <w:pPr>
-        <w:spacing w:before="0" w:after="0" w:line="80" w:lineRule="exact"/>
-      </w:pPr>
-      <w:r>
-        <w:rPr>
-          <w:rFonts w:ascii="Trade Gothic Next" w:hAnsi="Trade Gothic Next"/>
-          <w:sz w:val="4"/>
-        </w:rPr>
-      </w:r>
-    </w:p>
-    <w:tbl>
-      <w:tblPr>
-        <w:tblW w:type="auto" w:w="0"/>
-        <w:jc w:val="left"/>
-        <w:tblLayout w:type="fixed"/>
-        <w:tblLook w:firstColumn="1" w:firstRow="1" w:lastColumn="0" w:lastRow="0" w:noHBand="0" w:noVBand="1" w:val="04A0"/>
-        <w:tblLayout w:type="fixed"/>
-      </w:tblPr>
-      <w:tblGrid>
-        <w:gridCol w:w="10800"/>
-      </w:tblGrid>
-      <w:tr>
-        <w:tc>
-          <w:tcPr>
-            <w:tcW w:type="dxa" w:w="10800"/>
-            <w:tcBorders>
-              <w:bottom w:val="single" w:sz="4" w:color="C8CDC2"/>
-            </w:tcBorders>
-            <w:tcMar>
-              <w:top w:w="30" w:type="dxa"/>
-              <w:left w:w="40" w:type="dxa"/>
-              <w:bottom w:w="30" w:type="dxa"/>
-              <w:right w:w="40" w:type="dxa"/>
-            </w:tcMar>
-          </w:tcPr>
-          <w:p>
-            <w:pPr>
-              <w:spacing w:after="20"/>
-              <w:ind w:left="360" w:hanging="360"/>
-            </w:pPr>
-            <w:r>
-              <w:rPr>
-                <w:rFonts w:ascii="Trade Gothic Next" w:hAnsi="Trade Gothic Next"/>
-                <w:b/>
-                <w:color w:val="4D730E"/>
-                <w:sz w:val="20"/>
-                <w:u w:val="none"/>
-              </w:rPr>
-              <w:t xml:space="preserve">5   </w:t>
-            </w:r>
-            <w:r>
-              <w:rPr>
-                <w:rFonts w:ascii="Trade Gothic Next" w:hAnsi="Trade Gothic Next"/>
-                <w:b w:val="0"/>
-                <w:color w:val="14161B"/>
-                <w:sz w:val="20"/>
-                <w:u w:val="none"/>
-              </w:rPr>
-              <w:t>Chromium's configuration is not the one the filling order predicts. Write the predicted shorthand, then explain why the actual one has lower energy.</w:t>
-            </w:r>
-          </w:p>
-          <w:tbl>
-            <w:tblPr>
-              <w:tblW w:type="auto" w:w="0"/>
-              <w:tblLayout w:type="fixed"/>
-              <w:tblLook w:firstColumn="1" w:firstRow="1" w:lastColumn="0" w:lastRow="0" w:noHBand="0" w:noVBand="1" w:val="04A0"/>
-              <w:tblLayout w:type="fixed"/>
-            </w:tblPr>
-            <w:tblGrid>
-              <w:gridCol w:w="10152"/>
-            </w:tblGrid>
-            <w:tr>
-              <w:trPr>
-                <w:cantSplit/>
-                <w:trHeight w:val="460" w:hRule="atLeast"/>
-              </w:trPr>
-              <w:tc>
-                <w:tcPr>
-                  <w:tcW w:type="dxa" w:w="10152"/>
-                  <w:vAlign w:val="bottom"/>
-                  <w:tcBorders>
-                    <w:bottom w:val="single" w:sz="6" w:color="C8CDC2"/>
-                  </w:tcBorders>
-                  <w:tcMar>
-                    <w:top w:w="0" w:type="dxa"/>
-                    <w:left w:w="60" w:type="dxa"/>
-                    <w:bottom w:w="10" w:type="dxa"/>
-                    <w:right w:w="0" w:type="dxa"/>
-                  </w:tcMar>
-                </w:tcPr>
-                <w:p>
-                  <w:pPr>
-                    <w:spacing w:after="0"/>
-                  </w:pPr>
-                </w:p>
-              </w:tc>
-            </w:tr>
-          </w:tbl>
-          <w:p/>
-          <w:tbl>
-            <w:tblPr>
-              <w:tblW w:type="auto" w:w="0"/>
-              <w:tblLayout w:type="fixed"/>
-              <w:tblLook w:firstColumn="1" w:firstRow="1" w:lastColumn="0" w:lastRow="0" w:noHBand="0" w:noVBand="1" w:val="04A0"/>
-              <w:tblLayout w:type="fixed"/>
-            </w:tblPr>
-            <w:tblGrid>
-              <w:gridCol w:w="10152"/>
-            </w:tblGrid>
-            <w:tr>
-              <w:trPr>
-                <w:cantSplit/>
-                <w:trHeight w:val="460" w:hRule="atLeast"/>
-              </w:trPr>
-              <w:tc>
-                <w:tcPr>
-                  <w:tcW w:type="dxa" w:w="10152"/>
-                  <w:vAlign w:val="bottom"/>
-                  <w:tcBorders>
-                    <w:bottom w:val="single" w:sz="6" w:color="C8CDC2"/>
-                  </w:tcBorders>
-                  <w:tcMar>
-                    <w:top w:w="0" w:type="dxa"/>
-                    <w:left w:w="60" w:type="dxa"/>
-                    <w:bottom w:w="10" w:type="dxa"/>
-                    <w:right w:w="0" w:type="dxa"/>
-                  </w:tcMar>
-                </w:tcPr>
-                <w:p>
-                  <w:pPr>
-                    <w:spacing w:after="0"/>
-                  </w:pPr>
-                </w:p>
-              </w:tc>
-            </w:tr>
-          </w:tbl>
-          <w:p>
-            <w:pPr>
-              <w:spacing w:before="0" w:after="0" w:line="20" w:lineRule="exact"/>
-            </w:pPr>
-          </w:p>
-        </w:tc>
-      </w:tr>
-    </w:tbl>
-    <w:p>
-      <w:pPr>
-        <w:pageBreakBefore/>
-        <w:spacing w:before="0" w:after="0" w:line="20" w:lineRule="exact"/>
-      </w:pPr>
-      <w:r>
-        <w:rPr>
-          <w:rFonts w:ascii="Trade Gothic Next" w:hAnsi="Trade Gothic Next"/>
-          <w:sz w:val="2"/>
-        </w:rPr>
-      </w:r>
-    </w:p>
-    <w:p>
-      <w:pPr>
-        <w:spacing w:before="0" w:after="0" w:line="140" w:lineRule="exact"/>
-      </w:pPr>
-      <w:r>
-        <w:rPr>
-          <w:rFonts w:ascii="Trade Gothic Next" w:hAnsi="Trade Gothic Next"/>
-          <w:sz w:val="10"/>
-        </w:rPr>
-      </w:r>
-    </w:p>
-    <w:tbl>
-      <w:tblPr>
-        <w:tblW w:type="auto" w:w="0"/>
-        <w:tblLayout w:type="fixed"/>
-        <w:tblLook w:firstColumn="1" w:firstRow="1" w:lastColumn="0" w:lastRow="0" w:noHBand="0" w:noVBand="1" w:val="04A0"/>
-        <w:tblLayout w:type="fixed"/>
-      </w:tblPr>
-      <w:tblGrid>
-        <w:gridCol w:w="9072"/>
-        <w:gridCol w:w="1728"/>
-      </w:tblGrid>
-      <w:tr>
-        <w:tc>
-          <w:tcPr>
-            <w:tcW w:type="dxa" w:w="9072"/>
-            <w:tcBorders>
-              <w:bottom w:val="single" w:sz="10" w:color="14161B"/>
-            </w:tcBorders>
-            <w:vAlign w:val="center"/>
-            <w:tcMar>
-              <w:top w:w="0" w:type="dxa"/>
-              <w:left w:w="0" w:type="dxa"/>
-              <w:bottom w:w="30" w:type="dxa"/>
-              <w:right w:w="60" w:type="dxa"/>
-            </w:tcMar>
-          </w:tcPr>
-          <w:p>
-            <w:pPr>
-              <w:keepNext/>
-              <w:spacing w:after="0"/>
-              <w:jc w:val="left"/>
-            </w:pPr>
-            <w:r>
-              <w:rPr>
-                <w:rFonts w:ascii="Trade Gothic Next" w:hAnsi="Trade Gothic Next"/>
-                <w:b/>
-                <w:color w:val="14161B"/>
-                <w:sz w:val="20"/>
-                <w:u w:val="none"/>
-              </w:rPr>
-              <w:t>Part 3   Ions</w:t>
-            </w:r>
-          </w:p>
-        </w:tc>
-        <w:tc>
-          <w:tcPr>
-            <w:tcW w:type="dxa" w:w="1728"/>
-            <w:tcBorders>
-              <w:bottom w:val="single" w:sz="10" w:color="14161B"/>
-            </w:tcBorders>
-            <w:vAlign w:val="center"/>
-            <w:tcMar>
-              <w:top w:w="0" w:type="dxa"/>
-              <w:left w:w="60" w:type="dxa"/>
-              <w:bottom w:w="30" w:type="dxa"/>
-              <w:right w:w="0" w:type="dxa"/>
-            </w:tcMar>
-          </w:tcPr>
-          <w:p>
-            <w:pPr>
-              <w:keepNext/>
-              <w:spacing w:after="0"/>
-              <w:jc w:val="right"/>
-            </w:pPr>
-            <w:r>
-              <w:rPr>
-                <w:rFonts w:ascii="Trade Gothic Next" w:hAnsi="Trade Gothic Next"/>
-                <w:b w:val="0"/>
-                <w:color w:val="55604F"/>
-                <w:sz w:val="18"/>
-                <w:u w:val="none"/>
-              </w:rPr>
-              <w:t>8 points</w:t>
-            </w:r>
-          </w:p>
-        </w:tc>
-      </w:tr>
-    </w:tbl>
-    <w:p>
-      <w:pPr>
-        <w:spacing w:before="0" w:after="0" w:line="60" w:lineRule="exact"/>
-      </w:pPr>
-      <w:r>
-        <w:rPr>
-          <w:rFonts w:ascii="Trade Gothic Next" w:hAnsi="Trade Gothic Next"/>
-          <w:sz w:val="2"/>
-        </w:rPr>
-      </w:r>
-    </w:p>
-    <w:tbl>
-      <w:tblPr>
-        <w:tblW w:type="auto" w:w="0"/>
-        <w:jc w:val="left"/>
-        <w:tblLayout w:type="fixed"/>
-        <w:tblLook w:firstColumn="1" w:firstRow="1" w:lastColumn="0" w:lastRow="0" w:noHBand="0" w:noVBand="1" w:val="04A0"/>
-        <w:tblLayout w:type="fixed"/>
-      </w:tblPr>
-      <w:tblGrid>
-        <w:gridCol w:w="10800"/>
-      </w:tblGrid>
-      <w:tr>
-        <w:tc>
-          <w:tcPr>
-            <w:tcW w:type="dxa" w:w="10800"/>
-            <w:tcMar>
-              <w:top w:w="0" w:type="dxa"/>
-              <w:left w:w="40" w:type="dxa"/>
-              <w:bottom w:w="20" w:type="dxa"/>
-              <w:right w:w="40" w:type="dxa"/>
-            </w:tcMar>
-          </w:tcPr>
-          <w:p>
-            <w:pPr>
-              <w:spacing w:after="0"/>
-              <w:ind w:left="360" w:hanging="360"/>
-            </w:pPr>
-            <w:r>
-              <w:rPr>
-                <w:rFonts w:ascii="Trade Gothic Next" w:hAnsi="Trade Gothic Next"/>
-                <w:b/>
-                <w:color w:val="4D730E"/>
-                <w:sz w:val="20"/>
-                <w:u w:val="none"/>
-              </w:rPr>
-              <w:t xml:space="preserve">6   </w:t>
-            </w:r>
-            <w:r>
-              <w:rPr>
-                <w:rFonts w:ascii="Trade Gothic Next" w:hAnsi="Trade Gothic Next"/>
-                <w:b w:val="0"/>
-                <w:color w:val="14161B"/>
-                <w:sz w:val="20"/>
-                <w:u w:val="none"/>
-              </w:rPr>
-              <w:t>Complete the table. For the last column, name the noble gas with the same number of electrons as the ion.</w:t>
-            </w:r>
-          </w:p>
-        </w:tc>
-      </w:tr>
-    </w:tbl>
-    <w:tbl>
-      <w:tblPr>
-        <w:tblW w:type="auto" w:w="0"/>
-        <w:tblLayout w:type="fixed"/>
-        <w:tblLook w:firstColumn="1" w:firstRow="1" w:lastColumn="0" w:lastRow="0" w:noHBand="0" w:noVBand="1" w:val="04A0"/>
-        <w:tblLayout w:type="fixed"/>
-      </w:tblPr>
-      <w:tblGrid>
-        <w:gridCol w:w="2736"/>
-        <w:gridCol w:w="1872"/>
-        <w:gridCol w:w="2160"/>
-        <w:gridCol w:w="2160"/>
-        <w:gridCol w:w="1872"/>
-      </w:tblGrid>
-      <w:tr>
-        <w:tc>
-          <w:tcPr>
-            <w:tcW w:type="dxa" w:w="2736"/>
-            <w:tcBorders>
-              <w:bottom w:val="single" w:sz="12" w:color="A3E635"/>
-            </w:tcBorders>
-            <w:vAlign w:val="center"/>
-            <w:tcMar>
-              <w:top w:w="20" w:type="dxa"/>
-              <w:left w:w="60" w:type="dxa"/>
-              <w:bottom w:w="20" w:type="dxa"/>
-              <w:right w:w="40" w:type="dxa"/>
-            </w:tcMar>
-          </w:tcPr>
-          <w:p>
-            <w:pPr>
-              <w:keepNext/>
-              <w:spacing w:after="0"/>
-            </w:pPr>
-            <w:r>
-              <w:rPr>
-                <w:rFonts w:ascii="Trade Gothic Next" w:hAnsi="Trade Gothic Next"/>
-                <w:b/>
-                <w:color w:val="4D730E"/>
-                <w:sz w:val="16"/>
-                <w:u w:val="none"/>
-              </w:rPr>
-              <w:t>ATOM</w:t>
-            </w:r>
-          </w:p>
-        </w:tc>
-        <w:tc>
-          <w:tcPr>
-            <w:tcW w:type="dxa" w:w="1872"/>
-            <w:tcBorders>
-              <w:bottom w:val="single" w:sz="12" w:color="A3E635"/>
-            </w:tcBorders>
-            <w:vAlign w:val="center"/>
-            <w:tcMar>
-              <w:top w:w="20" w:type="dxa"/>
-              <w:left w:w="60" w:type="dxa"/>
-              <w:bottom w:w="20" w:type="dxa"/>
-              <w:right w:w="40" w:type="dxa"/>
-            </w:tcMar>
-          </w:tcPr>
-          <w:p>
-            <w:pPr>
-              <w:keepNext/>
-              <w:spacing w:after="0"/>
-            </w:pPr>
-            <w:r>
-              <w:rPr>
-                <w:rFonts w:ascii="Trade Gothic Next" w:hAnsi="Trade Gothic Next"/>
-                <w:b/>
-                <w:color w:val="4D730E"/>
-                <w:sz w:val="16"/>
-                <w:u w:val="none"/>
-              </w:rPr>
-              <w:t>VALENCE e</w:t>
-            </w:r>
-            <w:r>
-              <w:rPr>
-                <w:rFonts w:ascii="Trade Gothic Next" w:hAnsi="Trade Gothic Next"/>
-                <w:b/>
-                <w:color w:val="4D730E"/>
-                <w:sz w:val="16"/>
-                <w:u w:val="none"/>
-                <w:vertAlign w:val="superscript"/>
-              </w:rPr>
-              <w:t>−</w:t>
-            </w:r>
-          </w:p>
-        </w:tc>
-        <w:tc>
-          <w:tcPr>
-            <w:tcW w:type="dxa" w:w="2160"/>
-            <w:tcBorders>
-              <w:bottom w:val="single" w:sz="12" w:color="A3E635"/>
-            </w:tcBorders>
-            <w:vAlign w:val="center"/>
-            <w:tcMar>
-              <w:top w:w="20" w:type="dxa"/>
-              <w:left w:w="60" w:type="dxa"/>
-              <w:bottom w:w="20" w:type="dxa"/>
-              <w:right w:w="40" w:type="dxa"/>
-            </w:tcMar>
-          </w:tcPr>
-          <w:p>
-            <w:pPr>
-              <w:keepNext/>
-              <w:spacing w:after="0"/>
-            </w:pPr>
-            <w:r>
-              <w:rPr>
-                <w:rFonts w:ascii="Trade Gothic Next" w:hAnsi="Trade Gothic Next"/>
-                <w:b/>
-                <w:color w:val="4D730E"/>
-                <w:sz w:val="16"/>
-                <w:u w:val="none"/>
-              </w:rPr>
-              <w:t>ION IT FORMS</w:t>
-            </w:r>
-          </w:p>
-        </w:tc>
-        <w:tc>
-          <w:tcPr>
-            <w:tcW w:type="dxa" w:w="2160"/>
-            <w:tcBorders>
-              <w:bottom w:val="single" w:sz="12" w:color="A3E635"/>
-            </w:tcBorders>
-            <w:vAlign w:val="center"/>
-            <w:tcMar>
-              <w:top w:w="20" w:type="dxa"/>
-              <w:left w:w="60" w:type="dxa"/>
-              <w:bottom w:w="20" w:type="dxa"/>
-              <w:right w:w="40" w:type="dxa"/>
-            </w:tcMar>
-          </w:tcPr>
-          <w:p>
-            <w:pPr>
-              <w:keepNext/>
-              <w:spacing w:after="0"/>
-            </w:pPr>
-            <w:r>
-              <w:rPr>
-                <w:rFonts w:ascii="Trade Gothic Next" w:hAnsi="Trade Gothic Next"/>
-                <w:b/>
-                <w:color w:val="4D730E"/>
-                <w:sz w:val="16"/>
-                <w:u w:val="none"/>
-              </w:rPr>
-              <w:t>e</w:t>
-            </w:r>
-            <w:r>
-              <w:rPr>
-                <w:rFonts w:ascii="Trade Gothic Next" w:hAnsi="Trade Gothic Next"/>
-                <w:b/>
-                <w:color w:val="4D730E"/>
-                <w:sz w:val="16"/>
-                <w:u w:val="none"/>
-                <w:vertAlign w:val="superscript"/>
-              </w:rPr>
-              <w:t>−</w:t>
-            </w:r>
-            <w:r>
-              <w:rPr>
-                <w:rFonts w:ascii="Trade Gothic Next" w:hAnsi="Trade Gothic Next"/>
-                <w:b/>
-                <w:color w:val="4D730E"/>
-                <w:sz w:val="16"/>
-                <w:u w:val="none"/>
-              </w:rPr>
-              <w:t xml:space="preserve"> IN THE ION</w:t>
-            </w:r>
-          </w:p>
-        </w:tc>
-        <w:tc>
-          <w:tcPr>
-            <w:tcW w:type="dxa" w:w="1872"/>
-            <w:tcBorders>
-              <w:bottom w:val="single" w:sz="12" w:color="A3E635"/>
-            </w:tcBorders>
-            <w:vAlign w:val="center"/>
-            <w:tcMar>
-              <w:top w:w="20" w:type="dxa"/>
-              <w:left w:w="60" w:type="dxa"/>
-              <w:bottom w:w="20" w:type="dxa"/>
-              <w:right w:w="40" w:type="dxa"/>
-            </w:tcMar>
-          </w:tcPr>
-          <w:p>
-            <w:pPr>
-              <w:keepNext/>
-              <w:spacing w:after="0"/>
-            </w:pPr>
-            <w:r>
-              <w:rPr>
-                <w:rFonts w:ascii="Trade Gothic Next" w:hAnsi="Trade Gothic Next"/>
-                <w:b/>
-                <w:color w:val="4D730E"/>
-                <w:sz w:val="16"/>
-                <w:u w:val="none"/>
-              </w:rPr>
-              <w:t>SAME AS</w:t>
-            </w:r>
-          </w:p>
-        </w:tc>
-      </w:tr>
-      <w:tr>
-        <w:trPr>
-          <w:cantSplit/>
-          <w:trHeight w:val="576" w:hRule="atLeast"/>
-        </w:trPr>
-        <w:tc>
-          <w:tcPr>
-            <w:tcW w:type="dxa" w:w="2736"/>
-            <w:tcBorders>
-              <w:top w:val="single" w:sz="4" w:color="C8CDC2"/>
-              <w:left w:val="single" w:sz="4" w:color="C8CDC2"/>
-              <w:bottom w:val="single" w:sz="4" w:color="C8CDC2"/>
-              <w:right w:val="single" w:sz="4" w:color="C8CDC2"/>
-            </w:tcBorders>
-            <w:vAlign w:val="center"/>
-            <w:tcMar>
-              <w:top w:w="10" w:type="dxa"/>
-              <w:left w:w="60" w:type="dxa"/>
-              <w:bottom w:w="10" w:type="dxa"/>
-              <w:right w:w="40" w:type="dxa"/>
-            </w:tcMar>
-          </w:tcPr>
-          <w:p>
-            <w:pPr>
-              <w:keepNext/>
-              <w:spacing w:after="0"/>
-            </w:pPr>
-            <w:r>
-              <w:rPr>
-                <w:rFonts w:ascii="Trade Gothic Next" w:hAnsi="Trade Gothic Next"/>
-                <w:b/>
-                <w:color w:val="14161B"/>
-                <w:sz w:val="20"/>
-                <w:u w:val="none"/>
-              </w:rPr>
-              <w:t>Rubidium, Rb</w:t>
-            </w:r>
-          </w:p>
-        </w:tc>
-        <w:tc>
-          <w:tcPr>
-            <w:tcW w:type="dxa" w:w="1872"/>
-            <w:tcBorders>
-              <w:top w:val="single" w:sz="4" w:color="C8CDC2"/>
-              <w:left w:val="single" w:sz="4" w:color="C8CDC2"/>
-              <w:bottom w:val="single" w:sz="4" w:color="C8CDC2"/>
-              <w:right w:val="single" w:sz="4" w:color="C8CDC2"/>
-            </w:tcBorders>
-            <w:vAlign w:val="center"/>
-            <w:tcMar>
-              <w:top w:w="10" w:type="dxa"/>
-              <w:left w:w="60" w:type="dxa"/>
-              <w:bottom w:w="10" w:type="dxa"/>
-              <w:right w:w="40" w:type="dxa"/>
-            </w:tcMar>
-          </w:tcPr>
-          <w:p>
-            <w:pPr>
-              <w:keepNext/>
-              <w:spacing w:after="0"/>
-            </w:pPr>
-          </w:p>
-        </w:tc>
-        <w:tc>
-          <w:tcPr>
-            <w:tcW w:type="dxa" w:w="2160"/>
-            <w:tcBorders>
-              <w:top w:val="single" w:sz="4" w:color="C8CDC2"/>
-              <w:left w:val="single" w:sz="4" w:color="C8CDC2"/>
-              <w:bottom w:val="single" w:sz="4" w:color="C8CDC2"/>
-              <w:right w:val="single" w:sz="4" w:color="C8CDC2"/>
-            </w:tcBorders>
-            <w:vAlign w:val="center"/>
-            <w:tcMar>
-              <w:top w:w="10" w:type="dxa"/>
-              <w:left w:w="60" w:type="dxa"/>
-              <w:bottom w:w="10" w:type="dxa"/>
-              <w:right w:w="40" w:type="dxa"/>
-            </w:tcMar>
-          </w:tcPr>
-          <w:p>
-            <w:pPr>
-              <w:keepNext/>
-              <w:spacing w:after="0"/>
-            </w:pPr>
-          </w:p>
-        </w:tc>
-        <w:tc>
-          <w:tcPr>
-            <w:tcW w:type="dxa" w:w="2160"/>
-            <w:tcBorders>
-              <w:top w:val="single" w:sz="4" w:color="C8CDC2"/>
-              <w:left w:val="single" w:sz="4" w:color="C8CDC2"/>
-              <w:bottom w:val="single" w:sz="4" w:color="C8CDC2"/>
-              <w:right w:val="single" w:sz="4" w:color="C8CDC2"/>
-            </w:tcBorders>
-            <w:vAlign w:val="center"/>
-            <w:tcMar>
-              <w:top w:w="10" w:type="dxa"/>
-              <w:left w:w="60" w:type="dxa"/>
-              <w:bottom w:w="10" w:type="dxa"/>
-              <w:right w:w="40" w:type="dxa"/>
-            </w:tcMar>
-          </w:tcPr>
-          <w:p>
-            <w:pPr>
-              <w:keepNext/>
-              <w:spacing w:after="0"/>
-            </w:pPr>
-          </w:p>
-        </w:tc>
-        <w:tc>
-          <w:tcPr>
-            <w:tcW w:type="dxa" w:w="1872"/>
-            <w:tcBorders>
-              <w:top w:val="single" w:sz="4" w:color="C8CDC2"/>
-              <w:left w:val="single" w:sz="4" w:color="C8CDC2"/>
-              <w:bottom w:val="single" w:sz="4" w:color="C8CDC2"/>
-              <w:right w:val="single" w:sz="4" w:color="C8CDC2"/>
-            </w:tcBorders>
-            <w:vAlign w:val="center"/>
-            <w:tcMar>
-              <w:top w:w="10" w:type="dxa"/>
-              <w:left w:w="60" w:type="dxa"/>
-              <w:bottom w:w="10" w:type="dxa"/>
-              <w:right w:w="40" w:type="dxa"/>
-            </w:tcMar>
-          </w:tcPr>
-          <w:p>
-            <w:pPr>
-              <w:keepNext/>
-              <w:spacing w:after="0"/>
-            </w:pPr>
-          </w:p>
-        </w:tc>
-      </w:tr>
-      <w:tr>
-        <w:trPr>
-          <w:cantSplit/>
-          <w:trHeight w:val="576" w:hRule="atLeast"/>
-        </w:trPr>
-        <w:tc>
-          <w:tcPr>
-            <w:tcW w:type="dxa" w:w="2736"/>
-            <w:tcBorders>
-              <w:top w:val="single" w:sz="4" w:color="C8CDC2"/>
-              <w:left w:val="single" w:sz="4" w:color="C8CDC2"/>
-              <w:bottom w:val="single" w:sz="4" w:color="C8CDC2"/>
-              <w:right w:val="single" w:sz="4" w:color="C8CDC2"/>
-            </w:tcBorders>
-            <w:vAlign w:val="center"/>
-            <w:tcMar>
-              <w:top w:w="10" w:type="dxa"/>
-              <w:left w:w="60" w:type="dxa"/>
-              <w:bottom w:w="10" w:type="dxa"/>
-              <w:right w:w="40" w:type="dxa"/>
-            </w:tcMar>
-          </w:tcPr>
-          <w:p>
-            <w:pPr>
-              <w:keepNext/>
-              <w:spacing w:after="0"/>
-            </w:pPr>
-            <w:r>
-              <w:rPr>
-                <w:rFonts w:ascii="Trade Gothic Next" w:hAnsi="Trade Gothic Next"/>
-                <w:b/>
-                <w:color w:val="14161B"/>
-                <w:sz w:val="20"/>
-                <w:u w:val="none"/>
-              </w:rPr>
-              <w:t>Beryllium, Be</w:t>
-            </w:r>
-          </w:p>
-        </w:tc>
-        <w:tc>
-          <w:tcPr>
-            <w:tcW w:type="dxa" w:w="1872"/>
-            <w:tcBorders>
-              <w:top w:val="single" w:sz="4" w:color="C8CDC2"/>
-              <w:left w:val="single" w:sz="4" w:color="C8CDC2"/>
-              <w:bottom w:val="single" w:sz="4" w:color="C8CDC2"/>
-              <w:right w:val="single" w:sz="4" w:color="C8CDC2"/>
-            </w:tcBorders>
-            <w:vAlign w:val="center"/>
-            <w:tcMar>
-              <w:top w:w="10" w:type="dxa"/>
-              <w:left w:w="60" w:type="dxa"/>
-              <w:bottom w:w="10" w:type="dxa"/>
-              <w:right w:w="40" w:type="dxa"/>
-            </w:tcMar>
-          </w:tcPr>
-          <w:p>
-            <w:pPr>
-              <w:keepNext/>
-              <w:spacing w:after="0"/>
-            </w:pPr>
-          </w:p>
-        </w:tc>
-        <w:tc>
-          <w:tcPr>
-            <w:tcW w:type="dxa" w:w="2160"/>
-            <w:tcBorders>
-              <w:top w:val="single" w:sz="4" w:color="C8CDC2"/>
-              <w:left w:val="single" w:sz="4" w:color="C8CDC2"/>
-              <w:bottom w:val="single" w:sz="4" w:color="C8CDC2"/>
-              <w:right w:val="single" w:sz="4" w:color="C8CDC2"/>
-            </w:tcBorders>
-            <w:vAlign w:val="center"/>
-            <w:tcMar>
-              <w:top w:w="10" w:type="dxa"/>
-              <w:left w:w="60" w:type="dxa"/>
-              <w:bottom w:w="10" w:type="dxa"/>
-              <w:right w:w="40" w:type="dxa"/>
-            </w:tcMar>
-          </w:tcPr>
-          <w:p>
-            <w:pPr>
-              <w:keepNext/>
-              <w:spacing w:after="0"/>
-            </w:pPr>
-          </w:p>
-        </w:tc>
-        <w:tc>
-          <w:tcPr>
-            <w:tcW w:type="dxa" w:w="2160"/>
-            <w:tcBorders>
-              <w:top w:val="single" w:sz="4" w:color="C8CDC2"/>
-              <w:left w:val="single" w:sz="4" w:color="C8CDC2"/>
-              <w:bottom w:val="single" w:sz="4" w:color="C8CDC2"/>
-              <w:right w:val="single" w:sz="4" w:color="C8CDC2"/>
-            </w:tcBorders>
-            <w:vAlign w:val="center"/>
-            <w:tcMar>
-              <w:top w:w="10" w:type="dxa"/>
-              <w:left w:w="60" w:type="dxa"/>
-              <w:bottom w:w="10" w:type="dxa"/>
-              <w:right w:w="40" w:type="dxa"/>
-            </w:tcMar>
-          </w:tcPr>
-          <w:p>
-            <w:pPr>
-              <w:keepNext/>
-              <w:spacing w:after="0"/>
-            </w:pPr>
-          </w:p>
-        </w:tc>
-        <w:tc>
-          <w:tcPr>
-            <w:tcW w:type="dxa" w:w="1872"/>
-            <w:tcBorders>
-              <w:top w:val="single" w:sz="4" w:color="C8CDC2"/>
-              <w:left w:val="single" w:sz="4" w:color="C8CDC2"/>
-              <w:bottom w:val="single" w:sz="4" w:color="C8CDC2"/>
-              <w:right w:val="single" w:sz="4" w:color="C8CDC2"/>
-            </w:tcBorders>
-            <w:vAlign w:val="center"/>
-            <w:tcMar>
-              <w:top w:w="10" w:type="dxa"/>
-              <w:left w:w="60" w:type="dxa"/>
-              <w:bottom w:w="10" w:type="dxa"/>
-              <w:right w:w="40" w:type="dxa"/>
-            </w:tcMar>
-          </w:tcPr>
-          <w:p>
-            <w:pPr>
-              <w:keepNext/>
-              <w:spacing w:after="0"/>
-            </w:pPr>
-          </w:p>
-        </w:tc>
-      </w:tr>
-      <w:tr>
-        <w:trPr>
-          <w:cantSplit/>
-          <w:trHeight w:val="576" w:hRule="atLeast"/>
-        </w:trPr>
-        <w:tc>
-          <w:tcPr>
-            <w:tcW w:type="dxa" w:w="2736"/>
-            <w:tcBorders>
-              <w:top w:val="single" w:sz="4" w:color="C8CDC2"/>
-              <w:left w:val="single" w:sz="4" w:color="C8CDC2"/>
-              <w:bottom w:val="single" w:sz="4" w:color="C8CDC2"/>
-              <w:right w:val="single" w:sz="4" w:color="C8CDC2"/>
-            </w:tcBorders>
-            <w:vAlign w:val="center"/>
-            <w:tcMar>
-              <w:top w:w="10" w:type="dxa"/>
-              <w:left w:w="60" w:type="dxa"/>
-              <w:bottom w:w="10" w:type="dxa"/>
-              <w:right w:w="40" w:type="dxa"/>
-            </w:tcMar>
-          </w:tcPr>
-          <w:p>
-            <w:pPr>
-              <w:keepNext/>
-              <w:spacing w:after="0"/>
-            </w:pPr>
-            <w:r>
-              <w:rPr>
-                <w:rFonts w:ascii="Trade Gothic Next" w:hAnsi="Trade Gothic Next"/>
-                <w:b/>
-                <w:color w:val="14161B"/>
-                <w:sz w:val="20"/>
-                <w:u w:val="none"/>
-              </w:rPr>
-              <w:t>Selenium, Se</w:t>
-            </w:r>
-          </w:p>
-        </w:tc>
-        <w:tc>
-          <w:tcPr>
-            <w:tcW w:type="dxa" w:w="1872"/>
-            <w:tcBorders>
-              <w:top w:val="single" w:sz="4" w:color="C8CDC2"/>
-              <w:left w:val="single" w:sz="4" w:color="C8CDC2"/>
-              <w:bottom w:val="single" w:sz="4" w:color="C8CDC2"/>
-              <w:right w:val="single" w:sz="4" w:color="C8CDC2"/>
-            </w:tcBorders>
-            <w:vAlign w:val="center"/>
-            <w:tcMar>
-              <w:top w:w="10" w:type="dxa"/>
-              <w:left w:w="60" w:type="dxa"/>
-              <w:bottom w:w="10" w:type="dxa"/>
-              <w:right w:w="40" w:type="dxa"/>
-            </w:tcMar>
-          </w:tcPr>
-          <w:p>
-            <w:pPr>
-              <w:keepNext/>
-              <w:spacing w:after="0"/>
-            </w:pPr>
-          </w:p>
-        </w:tc>
-        <w:tc>
-          <w:tcPr>
-            <w:tcW w:type="dxa" w:w="2160"/>
-            <w:tcBorders>
-              <w:top w:val="single" w:sz="4" w:color="C8CDC2"/>
-              <w:left w:val="single" w:sz="4" w:color="C8CDC2"/>
-              <w:bottom w:val="single" w:sz="4" w:color="C8CDC2"/>
-              <w:right w:val="single" w:sz="4" w:color="C8CDC2"/>
-            </w:tcBorders>
-            <w:vAlign w:val="center"/>
-            <w:tcMar>
-              <w:top w:w="10" w:type="dxa"/>
-              <w:left w:w="60" w:type="dxa"/>
-              <w:bottom w:w="10" w:type="dxa"/>
-              <w:right w:w="40" w:type="dxa"/>
-            </w:tcMar>
-          </w:tcPr>
-          <w:p>
-            <w:pPr>
-              <w:keepNext/>
-              <w:spacing w:after="0"/>
-            </w:pPr>
-          </w:p>
-        </w:tc>
-        <w:tc>
-          <w:tcPr>
-            <w:tcW w:type="dxa" w:w="2160"/>
-            <w:tcBorders>
-              <w:top w:val="single" w:sz="4" w:color="C8CDC2"/>
-              <w:left w:val="single" w:sz="4" w:color="C8CDC2"/>
-              <w:bottom w:val="single" w:sz="4" w:color="C8CDC2"/>
-              <w:right w:val="single" w:sz="4" w:color="C8CDC2"/>
-            </w:tcBorders>
-            <w:vAlign w:val="center"/>
-            <w:tcMar>
-              <w:top w:w="10" w:type="dxa"/>
-              <w:left w:w="60" w:type="dxa"/>
-              <w:bottom w:w="10" w:type="dxa"/>
-              <w:right w:w="40" w:type="dxa"/>
-            </w:tcMar>
-          </w:tcPr>
-          <w:p>
-            <w:pPr>
-              <w:keepNext/>
-              <w:spacing w:after="0"/>
-            </w:pPr>
-          </w:p>
-        </w:tc>
-        <w:tc>
-          <w:tcPr>
-            <w:tcW w:type="dxa" w:w="1872"/>
-            <w:tcBorders>
-              <w:top w:val="single" w:sz="4" w:color="C8CDC2"/>
-              <w:left w:val="single" w:sz="4" w:color="C8CDC2"/>
-              <w:bottom w:val="single" w:sz="4" w:color="C8CDC2"/>
-              <w:right w:val="single" w:sz="4" w:color="C8CDC2"/>
-            </w:tcBorders>
-            <w:vAlign w:val="center"/>
-            <w:tcMar>
-              <w:top w:w="10" w:type="dxa"/>
-              <w:left w:w="60" w:type="dxa"/>
-              <w:bottom w:w="10" w:type="dxa"/>
-              <w:right w:w="40" w:type="dxa"/>
-            </w:tcMar>
-          </w:tcPr>
-          <w:p>
-            <w:pPr>
-              <w:keepNext/>
-              <w:spacing w:after="0"/>
-            </w:pPr>
-          </w:p>
-        </w:tc>
-      </w:tr>
-      <w:tr>
-        <w:trPr>
-          <w:cantSplit/>
-          <w:trHeight w:val="576" w:hRule="atLeast"/>
-        </w:trPr>
-        <w:tc>
-          <w:tcPr>
-            <w:tcW w:type="dxa" w:w="2736"/>
-            <w:tcBorders>
-              <w:top w:val="single" w:sz="4" w:color="C8CDC2"/>
-              <w:left w:val="single" w:sz="4" w:color="C8CDC2"/>
-              <w:bottom w:val="single" w:sz="4" w:color="C8CDC2"/>
-              <w:right w:val="single" w:sz="4" w:color="C8CDC2"/>
-            </w:tcBorders>
-            <w:vAlign w:val="center"/>
-            <w:tcMar>
-              <w:top w:w="10" w:type="dxa"/>
-              <w:left w:w="60" w:type="dxa"/>
-              <w:bottom w:w="10" w:type="dxa"/>
-              <w:right w:w="40" w:type="dxa"/>
-            </w:tcMar>
-          </w:tcPr>
-          <w:p>
-            <w:pPr>
-              <w:spacing w:after="0"/>
-            </w:pPr>
-            <w:r>
-              <w:rPr>
-                <w:rFonts w:ascii="Trade Gothic Next" w:hAnsi="Trade Gothic Next"/>
-                <w:b/>
-                <w:color w:val="14161B"/>
-                <w:sz w:val="20"/>
-                <w:u w:val="none"/>
-              </w:rPr>
-              <w:t>Aluminum, Al</w:t>
-            </w:r>
-          </w:p>
-        </w:tc>
-        <w:tc>
-          <w:tcPr>
-            <w:tcW w:type="dxa" w:w="1872"/>
-            <w:tcBorders>
-              <w:top w:val="single" w:sz="4" w:color="C8CDC2"/>
-              <w:left w:val="single" w:sz="4" w:color="C8CDC2"/>
-              <w:bottom w:val="single" w:sz="4" w:color="C8CDC2"/>
-              <w:right w:val="single" w:sz="4" w:color="C8CDC2"/>
-            </w:tcBorders>
-            <w:vAlign w:val="center"/>
-            <w:tcMar>
-              <w:top w:w="10" w:type="dxa"/>
-              <w:left w:w="60" w:type="dxa"/>
-              <w:bottom w:w="10" w:type="dxa"/>
-              <w:right w:w="40" w:type="dxa"/>
-            </w:tcMar>
-          </w:tcPr>
-          <w:p>
-            <w:pPr>
-              <w:spacing w:after="0"/>
-            </w:pPr>
-          </w:p>
-        </w:tc>
-        <w:tc>
-          <w:tcPr>
-            <w:tcW w:type="dxa" w:w="2160"/>
-            <w:tcBorders>
-              <w:top w:val="single" w:sz="4" w:color="C8CDC2"/>
-              <w:left w:val="single" w:sz="4" w:color="C8CDC2"/>
-              <w:bottom w:val="single" w:sz="4" w:color="C8CDC2"/>
-              <w:right w:val="single" w:sz="4" w:color="C8CDC2"/>
-            </w:tcBorders>
-            <w:vAlign w:val="center"/>
-            <w:tcMar>
-              <w:top w:w="10" w:type="dxa"/>
-              <w:left w:w="60" w:type="dxa"/>
-              <w:bottom w:w="10" w:type="dxa"/>
-              <w:right w:w="40" w:type="dxa"/>
-            </w:tcMar>
-          </w:tcPr>
-          <w:p>
-            <w:pPr>
-              <w:spacing w:after="0"/>
-            </w:pPr>
-          </w:p>
-        </w:tc>
-        <w:tc>
-          <w:tcPr>
-            <w:tcW w:type="dxa" w:w="2160"/>
-            <w:tcBorders>
-              <w:top w:val="single" w:sz="4" w:color="C8CDC2"/>
-              <w:left w:val="single" w:sz="4" w:color="C8CDC2"/>
-              <w:bottom w:val="single" w:sz="4" w:color="C8CDC2"/>
-              <w:right w:val="single" w:sz="4" w:color="C8CDC2"/>
-            </w:tcBorders>
-            <w:vAlign w:val="center"/>
-            <w:tcMar>
-              <w:top w:w="10" w:type="dxa"/>
-              <w:left w:w="60" w:type="dxa"/>
-              <w:bottom w:w="10" w:type="dxa"/>
-              <w:right w:w="40" w:type="dxa"/>
-            </w:tcMar>
-          </w:tcPr>
-          <w:p>
-            <w:pPr>
-              <w:spacing w:after="0"/>
-            </w:pPr>
-          </w:p>
-        </w:tc>
-        <w:tc>
-          <w:tcPr>
-            <w:tcW w:type="dxa" w:w="1872"/>
-            <w:tcBorders>
-              <w:top w:val="single" w:sz="4" w:color="C8CDC2"/>
-              <w:left w:val="single" w:sz="4" w:color="C8CDC2"/>
-              <w:bottom w:val="single" w:sz="4" w:color="C8CDC2"/>
-              <w:right w:val="single" w:sz="4" w:color="C8CDC2"/>
-            </w:tcBorders>
-            <w:vAlign w:val="center"/>
-            <w:tcMar>
-              <w:top w:w="10" w:type="dxa"/>
-              <w:left w:w="60" w:type="dxa"/>
-              <w:bottom w:w="10" w:type="dxa"/>
-              <w:right w:w="40" w:type="dxa"/>
-            </w:tcMar>
-          </w:tcPr>
-          <w:p>
-            <w:pPr>
-              <w:spacing w:after="0"/>
-            </w:pPr>
-          </w:p>
-        </w:tc>
-      </w:tr>
-    </w:tbl>
-    <w:p>
-      <w:pPr>
-        <w:spacing w:before="0" w:after="0" w:line="140" w:lineRule="exact"/>
-      </w:pPr>
-      <w:r>
-        <w:rPr>
-          <w:rFonts w:ascii="Trade Gothic Next" w:hAnsi="Trade Gothic Next"/>
-          <w:sz w:val="10"/>
-        </w:rPr>
-      </w:r>
-    </w:p>
-    <w:tbl>
-      <w:tblPr>
-        <w:tblW w:type="auto" w:w="0"/>
-        <w:tblLayout w:type="fixed"/>
-        <w:tblLook w:firstColumn="1" w:firstRow="1" w:lastColumn="0" w:lastRow="0" w:noHBand="0" w:noVBand="1" w:val="04A0"/>
-        <w:tblLayout w:type="fixed"/>
-      </w:tblPr>
-      <w:tblGrid>
-        <w:gridCol w:w="9072"/>
-        <w:gridCol w:w="1728"/>
-      </w:tblGrid>
-      <w:tr>
-        <w:tc>
-          <w:tcPr>
-            <w:tcW w:type="dxa" w:w="9072"/>
-            <w:tcBorders>
-              <w:bottom w:val="single" w:sz="10" w:color="14161B"/>
-            </w:tcBorders>
-            <w:vAlign w:val="center"/>
-            <w:tcMar>
-              <w:top w:w="0" w:type="dxa"/>
-              <w:left w:w="0" w:type="dxa"/>
-              <w:bottom w:w="30" w:type="dxa"/>
-              <w:right w:w="60" w:type="dxa"/>
-            </w:tcMar>
-          </w:tcPr>
-          <w:p>
-            <w:pPr>
-              <w:keepNext/>
-              <w:spacing w:after="0"/>
-              <w:jc w:val="left"/>
-            </w:pPr>
-            <w:r>
-              <w:rPr>
-                <w:rFonts w:ascii="Trade Gothic Next" w:hAnsi="Trade Gothic Next"/>
-                <w:b/>
-                <w:color w:val="14161B"/>
-                <w:sz w:val="20"/>
-                <w:u w:val="none"/>
-              </w:rPr>
-              <w:t>Part 4   Flame colors</w:t>
-            </w:r>
-          </w:p>
-        </w:tc>
-        <w:tc>
-          <w:tcPr>
-            <w:tcW w:type="dxa" w:w="1728"/>
-            <w:tcBorders>
-              <w:bottom w:val="single" w:sz="10" w:color="14161B"/>
-            </w:tcBorders>
-            <w:vAlign w:val="center"/>
-            <w:tcMar>
-              <w:top w:w="0" w:type="dxa"/>
-              <w:left w:w="60" w:type="dxa"/>
-              <w:bottom w:w="30" w:type="dxa"/>
-              <w:right w:w="0" w:type="dxa"/>
-            </w:tcMar>
-          </w:tcPr>
-          <w:p>
-            <w:pPr>
-              <w:keepNext/>
-              <w:spacing w:after="0"/>
-              <w:jc w:val="right"/>
-            </w:pPr>
-            <w:r>
-              <w:rPr>
-                <w:rFonts w:ascii="Trade Gothic Next" w:hAnsi="Trade Gothic Next"/>
-                <w:b w:val="0"/>
-                <w:color w:val="55604F"/>
-                <w:sz w:val="18"/>
-                <w:u w:val="none"/>
-              </w:rPr>
-              <w:t>3 points</w:t>
-            </w:r>
-          </w:p>
-        </w:tc>
-      </w:tr>
-    </w:tbl>
-    <w:p>
-      <w:pPr>
-        <w:spacing w:before="0" w:after="0" w:line="60" w:lineRule="exact"/>
-      </w:pPr>
-      <w:r>
-        <w:rPr>
-          <w:rFonts w:ascii="Trade Gothic Next" w:hAnsi="Trade Gothic Next"/>
-          <w:sz w:val="2"/>
-        </w:rPr>
-      </w:r>
-    </w:p>
-    <w:tbl>
-      <w:tblPr>
-        <w:tblW w:type="auto" w:w="0"/>
-        <w:jc w:val="left"/>
-        <w:tblLayout w:type="fixed"/>
-        <w:tblLook w:firstColumn="1" w:firstRow="1" w:lastColumn="0" w:lastRow="0" w:noHBand="0" w:noVBand="1" w:val="04A0"/>
-        <w:tblLayout w:type="fixed"/>
-      </w:tblPr>
-      <w:tblGrid>
-        <w:gridCol w:w="10800"/>
-      </w:tblGrid>
-      <w:tr>
-        <w:tc>
-          <w:tcPr>
-            <w:tcW w:type="dxa" w:w="10800"/>
-            <w:tcBorders>
-              <w:bottom w:val="single" w:sz="4" w:color="C8CDC2"/>
-            </w:tcBorders>
-            <w:tcMar>
-              <w:top w:w="30" w:type="dxa"/>
-              <w:left w:w="40" w:type="dxa"/>
-              <w:bottom w:w="30" w:type="dxa"/>
-              <w:right w:w="40" w:type="dxa"/>
-            </w:tcMar>
-          </w:tcPr>
-          <w:p>
-            <w:pPr>
-              <w:spacing w:after="20"/>
-              <w:ind w:left="360" w:hanging="360"/>
-            </w:pPr>
-            <w:r>
-              <w:rPr>
-                <w:rFonts w:ascii="Trade Gothic Next" w:hAnsi="Trade Gothic Next"/>
-                <w:b/>
-                <w:color w:val="4D730E"/>
-                <w:sz w:val="20"/>
-                <w:u w:val="none"/>
-              </w:rPr>
-              <w:t xml:space="preserve">7   </w:t>
-            </w:r>
-            <w:r>
-              <w:rPr>
-                <w:rFonts w:ascii="Trade Gothic Next" w:hAnsi="Trade Gothic Next"/>
-                <w:b w:val="0"/>
-                <w:color w:val="14161B"/>
-                <w:sz w:val="20"/>
-                <w:u w:val="none"/>
-              </w:rPr>
-              <w:t>A sodium flame is yellow (589 nm). A lithium flame is crimson red (671 nm). Explain how the heated atoms give off light, and say which element's color comes from the larger energy drop and how you know.</w:t>
-            </w:r>
-          </w:p>
-          <w:tbl>
-            <w:tblPr>
-              <w:tblW w:type="auto" w:w="0"/>
-              <w:tblLayout w:type="fixed"/>
-              <w:tblLook w:firstColumn="1" w:firstRow="1" w:lastColumn="0" w:lastRow="0" w:noHBand="0" w:noVBand="1" w:val="04A0"/>
-              <w:tblLayout w:type="fixed"/>
-            </w:tblPr>
-            <w:tblGrid>
-              <w:gridCol w:w="10152"/>
-            </w:tblGrid>
-            <w:tr>
-              <w:trPr>
-                <w:cantSplit/>
-                <w:trHeight w:val="460" w:hRule="atLeast"/>
-              </w:trPr>
-              <w:tc>
-                <w:tcPr>
-                  <w:tcW w:type="dxa" w:w="10152"/>
-                  <w:vAlign w:val="bottom"/>
-                  <w:tcBorders>
-                    <w:bottom w:val="single" w:sz="6" w:color="C8CDC2"/>
-                  </w:tcBorders>
-                  <w:tcMar>
-                    <w:top w:w="0" w:type="dxa"/>
-                    <w:left w:w="60" w:type="dxa"/>
-                    <w:bottom w:w="10" w:type="dxa"/>
-                    <w:right w:w="0" w:type="dxa"/>
-                  </w:tcMar>
-                </w:tcPr>
-                <w:p>
-                  <w:pPr>
-                    <w:spacing w:after="0"/>
-                  </w:pPr>
-                </w:p>
-              </w:tc>
-            </w:tr>
-          </w:tbl>
-          <w:p/>
-          <w:tbl>
-            <w:tblPr>
-              <w:tblW w:type="auto" w:w="0"/>
-              <w:tblLayout w:type="fixed"/>
-              <w:tblLook w:firstColumn="1" w:firstRow="1" w:lastColumn="0" w:lastRow="0" w:noHBand="0" w:noVBand="1" w:val="04A0"/>
-              <w:tblLayout w:type="fixed"/>
-            </w:tblPr>
-            <w:tblGrid>
-              <w:gridCol w:w="10152"/>
-            </w:tblGrid>
-            <w:tr>
-              <w:trPr>
-                <w:cantSplit/>
-                <w:trHeight w:val="460" w:hRule="atLeast"/>
-              </w:trPr>
-              <w:tc>
-                <w:tcPr>
-                  <w:tcW w:type="dxa" w:w="10152"/>
-                  <w:vAlign w:val="bottom"/>
-                  <w:tcBorders>
-                    <w:bottom w:val="single" w:sz="6" w:color="C8CDC2"/>
-                  </w:tcBorders>
-                  <w:tcMar>
-                    <w:top w:w="0" w:type="dxa"/>
-                    <w:left w:w="60" w:type="dxa"/>
-                    <w:bottom w:w="10" w:type="dxa"/>
-                    <w:right w:w="0" w:type="dxa"/>
-                  </w:tcMar>
-                </w:tcPr>
-                <w:p>
-                  <w:pPr>
-                    <w:spacing w:after="0"/>
-                  </w:pPr>
-                </w:p>
-              </w:tc>
-            </w:tr>
-          </w:tbl>
-          <w:p/>
-          <w:tbl>
-            <w:tblPr>
-              <w:tblW w:type="auto" w:w="0"/>
-              <w:tblLayout w:type="fixed"/>
-              <w:tblLook w:firstColumn="1" w:firstRow="1" w:lastColumn="0" w:lastRow="0" w:noHBand="0" w:noVBand="1" w:val="04A0"/>
-              <w:tblLayout w:type="fixed"/>
-            </w:tblPr>
-            <w:tblGrid>
-              <w:gridCol w:w="10152"/>
-            </w:tblGrid>
-            <w:tr>
-              <w:trPr>
-                <w:cantSplit/>
-                <w:trHeight w:val="460" w:hRule="atLeast"/>
-              </w:trPr>
-              <w:tc>
-                <w:tcPr>
-                  <w:tcW w:type="dxa" w:w="10152"/>
-                  <w:vAlign w:val="bottom"/>
-                  <w:tcBorders>
-                    <w:bottom w:val="single" w:sz="6" w:color="C8CDC2"/>
-                  </w:tcBorders>
-                  <w:tcMar>
-                    <w:top w:w="0" w:type="dxa"/>
-                    <w:left w:w="60" w:type="dxa"/>
-                    <w:bottom w:w="10" w:type="dxa"/>
-                    <w:right w:w="0" w:type="dxa"/>
-                  </w:tcMar>
-                </w:tcPr>
-                <w:p>
-                  <w:pPr>
-                    <w:spacing w:after="0"/>
-                  </w:pPr>
-                </w:p>
-              </w:tc>
-            </w:tr>
-          </w:tbl>
-          <w:p/>
-          <w:tbl>
-            <w:tblPr>
-              <w:tblW w:type="auto" w:w="0"/>
-              <w:tblLayout w:type="fixed"/>
-              <w:tblLook w:firstColumn="1" w:firstRow="1" w:lastColumn="0" w:lastRow="0" w:noHBand="0" w:noVBand="1" w:val="04A0"/>
-              <w:tblLayout w:type="fixed"/>
-            </w:tblPr>
-            <w:tblGrid>
-              <w:gridCol w:w="10152"/>
-            </w:tblGrid>
-            <w:tr>
-              <w:trPr>
-                <w:cantSplit/>
-                <w:trHeight w:val="460" w:hRule="atLeast"/>
-              </w:trPr>
-              <w:tc>
-                <w:tcPr>
-                  <w:tcW w:type="dxa" w:w="10152"/>
-                  <w:vAlign w:val="bottom"/>
-                  <w:tcBorders>
-                    <w:bottom w:val="single" w:sz="6" w:color="C8CDC2"/>
-                  </w:tcBorders>
-                  <w:tcMar>
-                    <w:top w:w="0" w:type="dxa"/>
-                    <w:left w:w="60" w:type="dxa"/>
-                    <w:bottom w:w="10" w:type="dxa"/>
-                    <w:right w:w="0" w:type="dxa"/>
-                  </w:tcMar>
-                </w:tcPr>
-                <w:p>
-                  <w:pPr>
-                    <w:spacing w:after="0"/>
-                  </w:pPr>
-                </w:p>
-              </w:tc>
-            </w:tr>
-          </w:tbl>
-          <w:p>
-            <w:pPr>
-              <w:spacing w:before="0" w:after="0" w:line="20" w:lineRule="exact"/>
-            </w:pPr>
-          </w:p>
-        </w:tc>
-      </w:tr>
-    </w:tbl>
-    <w:p>
-      <w:pPr>
         <w:spacing w:before="0" w:after="0" w:line="20" w:lineRule="exact"/>
         <w:rPr>
           <w:sz w:val="2"/>
@@ -2614,7 +1414,7 @@
       </w:pPr>
     </w:p>
     <w:sectPr>
-      <w:footerReference w:type="default" r:id="rId13"/>
+      <w:footerReference w:type="default" r:id="rId15"/>
       <w:pgSz w:w="12240" w:h="15840"/>
       <w:pgMar w:top="634" w:right="720" w:bottom="634" w:left="720" w:header="720" w:footer="720" w:gutter="0"/>
       <w:cols w:space="720"/>

</xml_diff>